<commit_message>
Pre-Projeto.docx review and correction
</commit_message>
<xml_diff>
--- a/PLC/PLC-Liquid_Mixer_Project/Documents/Pre-Projeto.docx
+++ b/PLC/PLC-Liquid_Mixer_Project/Documents/Pre-Projeto.docx
@@ -281,7 +281,7 @@
           <w:sz w:val="24"/>
           <w:szCs w:val="24"/>
         </w:rPr>
-        <w:t xml:space="preserve">MISTURADOR AUTOMÁTICO DE LÍQUIDOS COM CLP ALTUS NEXTO XP340 E IHM</w:t>
+        <w:t xml:space="preserve">MISTURADOR AUTOMÁTICO DE LÍQUIDOS</w:t>
       </w:r>
     </w:p>
     <w:p>
@@ -292,127 +292,12 @@
       <w:r>
         <w:rPr>
           <w:rFonts w:ascii="Times New Roman" w:cs="Times New Roman" w:eastAsia="Times New Roman" w:hAnsi="Times New Roman"/>
-          <w:sz w:val="24"/>
-          <w:szCs w:val="24"/>
-        </w:rPr>
-        <w:t xml:space="preserve">Pré-projeto</w:t>
-      </w:r>
-    </w:p>
-    <w:p>
-      <w:pPr>
-        <w:spacing w:after="0" w:before="0" w:line="360"/>
-      </w:pPr>
-      <w:r>
-        <w:rPr>
-          <w:rFonts w:ascii="Times New Roman" w:cs="Times New Roman" w:eastAsia="Times New Roman" w:hAnsi="Times New Roman"/>
-          <w:sz w:val="24"/>
-          <w:szCs w:val="24"/>
-        </w:rPr>
-        <w:t xml:space="preserve"/>
-      </w:r>
-    </w:p>
-    <w:p>
-      <w:pPr>
-        <w:spacing w:after="0" w:before="0" w:line="360"/>
-      </w:pPr>
-      <w:r>
-        <w:rPr>
-          <w:rFonts w:ascii="Times New Roman" w:cs="Times New Roman" w:eastAsia="Times New Roman" w:hAnsi="Times New Roman"/>
-          <w:sz w:val="24"/>
-          <w:szCs w:val="24"/>
-        </w:rPr>
-        <w:t xml:space="preserve"/>
-      </w:r>
-    </w:p>
-    <w:p>
-      <w:pPr>
-        <w:spacing w:after="0" w:before="0" w:line="360"/>
-      </w:pPr>
-      <w:r>
-        <w:rPr>
-          <w:rFonts w:ascii="Times New Roman" w:cs="Times New Roman" w:eastAsia="Times New Roman" w:hAnsi="Times New Roman"/>
-          <w:sz w:val="24"/>
-          <w:szCs w:val="24"/>
-        </w:rPr>
-        <w:t xml:space="preserve"/>
-      </w:r>
-    </w:p>
-    <w:p>
-      <w:pPr>
-        <w:spacing w:after="0" w:before="0" w:line="360"/>
-      </w:pPr>
-      <w:r>
-        <w:rPr>
-          <w:rFonts w:ascii="Times New Roman" w:cs="Times New Roman" w:eastAsia="Times New Roman" w:hAnsi="Times New Roman"/>
-          <w:sz w:val="24"/>
-          <w:szCs w:val="24"/>
-        </w:rPr>
-        <w:t xml:space="preserve"/>
-      </w:r>
-    </w:p>
-    <w:p>
-      <w:pPr>
-        <w:spacing w:after="0" w:before="0" w:line="360"/>
-      </w:pPr>
-      <w:r>
-        <w:rPr>
-          <w:rFonts w:ascii="Times New Roman" w:cs="Times New Roman" w:eastAsia="Times New Roman" w:hAnsi="Times New Roman"/>
-          <w:sz w:val="24"/>
-          <w:szCs w:val="24"/>
-        </w:rPr>
-        <w:t xml:space="preserve"/>
-      </w:r>
-    </w:p>
-    <w:p>
-      <w:pPr>
-        <w:spacing w:after="0" w:before="0" w:line="360"/>
-      </w:pPr>
-      <w:r>
-        <w:rPr>
-          <w:rFonts w:ascii="Times New Roman" w:cs="Times New Roman" w:eastAsia="Times New Roman" w:hAnsi="Times New Roman"/>
-          <w:sz w:val="24"/>
-          <w:szCs w:val="24"/>
-        </w:rPr>
-        <w:t xml:space="preserve"/>
-      </w:r>
-    </w:p>
-    <w:p>
-      <w:pPr>
-        <w:spacing w:after="0" w:before="0" w:line="360"/>
-      </w:pPr>
-      <w:r>
-        <w:rPr>
-          <w:rFonts w:ascii="Times New Roman" w:cs="Times New Roman" w:eastAsia="Times New Roman" w:hAnsi="Times New Roman"/>
-          <w:sz w:val="24"/>
-          <w:szCs w:val="24"/>
-        </w:rPr>
-        <w:t xml:space="preserve"/>
-      </w:r>
-    </w:p>
-    <w:p>
-      <w:pPr>
-        <w:spacing w:after="0" w:before="0" w:line="360"/>
-      </w:pPr>
-      <w:r>
-        <w:rPr>
-          <w:rFonts w:ascii="Times New Roman" w:cs="Times New Roman" w:eastAsia="Times New Roman" w:hAnsi="Times New Roman"/>
-          <w:sz w:val="24"/>
-          <w:szCs w:val="24"/>
-        </w:rPr>
-        <w:t xml:space="preserve"/>
-      </w:r>
-    </w:p>
-    <w:p>
-      <w:pPr>
-        <w:spacing w:after="0" w:before="0" w:line="360"/>
-      </w:pPr>
-      <w:r>
-        <w:rPr>
-          <w:rFonts w:ascii="Times New Roman" w:cs="Times New Roman" w:eastAsia="Times New Roman" w:hAnsi="Times New Roman"/>
-          <w:sz w:val="24"/>
-          <w:szCs w:val="24"/>
-        </w:rPr>
-        <w:t xml:space="preserve"/>
+          <w:b/>
+          <w:bCs/>
+          <w:sz w:val="24"/>
+          <w:szCs w:val="24"/>
+        </w:rPr>
+        <w:t xml:space="preserve">COM CLP ALTUS NEXTO XP340 E IHM</w:t>
       </w:r>
     </w:p>
     <w:p>
@@ -426,7 +311,124 @@
           <w:sz w:val="24"/>
           <w:szCs w:val="24"/>
         </w:rPr>
-        <w:t xml:space="preserve">LIMEIRA – SP</w:t>
+        <w:t xml:space="preserve">Pré-projeto</w:t>
+      </w:r>
+    </w:p>
+    <w:p>
+      <w:pPr>
+        <w:spacing w:after="0" w:before="0" w:line="360"/>
+      </w:pPr>
+      <w:r>
+        <w:rPr>
+          <w:rFonts w:ascii="Times New Roman" w:cs="Times New Roman" w:eastAsia="Times New Roman" w:hAnsi="Times New Roman"/>
+          <w:sz w:val="24"/>
+          <w:szCs w:val="24"/>
+        </w:rPr>
+        <w:t xml:space="preserve"/>
+      </w:r>
+    </w:p>
+    <w:p>
+      <w:pPr>
+        <w:spacing w:after="0" w:before="0" w:line="360"/>
+      </w:pPr>
+      <w:r>
+        <w:rPr>
+          <w:rFonts w:ascii="Times New Roman" w:cs="Times New Roman" w:eastAsia="Times New Roman" w:hAnsi="Times New Roman"/>
+          <w:sz w:val="24"/>
+          <w:szCs w:val="24"/>
+        </w:rPr>
+        <w:t xml:space="preserve"/>
+      </w:r>
+    </w:p>
+    <w:p>
+      <w:pPr>
+        <w:spacing w:after="0" w:before="0" w:line="360"/>
+      </w:pPr>
+      <w:r>
+        <w:rPr>
+          <w:rFonts w:ascii="Times New Roman" w:cs="Times New Roman" w:eastAsia="Times New Roman" w:hAnsi="Times New Roman"/>
+          <w:sz w:val="24"/>
+          <w:szCs w:val="24"/>
+        </w:rPr>
+        <w:t xml:space="preserve"/>
+      </w:r>
+    </w:p>
+    <w:p>
+      <w:pPr>
+        <w:spacing w:after="0" w:before="0" w:line="360"/>
+      </w:pPr>
+      <w:r>
+        <w:rPr>
+          <w:rFonts w:ascii="Times New Roman" w:cs="Times New Roman" w:eastAsia="Times New Roman" w:hAnsi="Times New Roman"/>
+          <w:sz w:val="24"/>
+          <w:szCs w:val="24"/>
+        </w:rPr>
+        <w:t xml:space="preserve"/>
+      </w:r>
+    </w:p>
+    <w:p>
+      <w:pPr>
+        <w:spacing w:after="0" w:before="0" w:line="360"/>
+      </w:pPr>
+      <w:r>
+        <w:rPr>
+          <w:rFonts w:ascii="Times New Roman" w:cs="Times New Roman" w:eastAsia="Times New Roman" w:hAnsi="Times New Roman"/>
+          <w:sz w:val="24"/>
+          <w:szCs w:val="24"/>
+        </w:rPr>
+        <w:t xml:space="preserve"/>
+      </w:r>
+    </w:p>
+    <w:p>
+      <w:pPr>
+        <w:spacing w:after="0" w:before="0" w:line="360"/>
+      </w:pPr>
+      <w:r>
+        <w:rPr>
+          <w:rFonts w:ascii="Times New Roman" w:cs="Times New Roman" w:eastAsia="Times New Roman" w:hAnsi="Times New Roman"/>
+          <w:sz w:val="24"/>
+          <w:szCs w:val="24"/>
+        </w:rPr>
+        <w:t xml:space="preserve"/>
+      </w:r>
+    </w:p>
+    <w:p>
+      <w:pPr>
+        <w:spacing w:after="0" w:before="0" w:line="360"/>
+      </w:pPr>
+      <w:r>
+        <w:rPr>
+          <w:rFonts w:ascii="Times New Roman" w:cs="Times New Roman" w:eastAsia="Times New Roman" w:hAnsi="Times New Roman"/>
+          <w:sz w:val="24"/>
+          <w:szCs w:val="24"/>
+        </w:rPr>
+        <w:t xml:space="preserve"/>
+      </w:r>
+    </w:p>
+    <w:p>
+      <w:pPr>
+        <w:spacing w:after="0" w:before="0" w:line="360"/>
+      </w:pPr>
+      <w:r>
+        <w:rPr>
+          <w:rFonts w:ascii="Times New Roman" w:cs="Times New Roman" w:eastAsia="Times New Roman" w:hAnsi="Times New Roman"/>
+          <w:sz w:val="24"/>
+          <w:szCs w:val="24"/>
+        </w:rPr>
+        <w:t xml:space="preserve"/>
+      </w:r>
+    </w:p>
+    <w:p>
+      <w:pPr>
+        <w:spacing w:after="0" w:before="0" w:line="360"/>
+      </w:pPr>
+      <w:r>
+        <w:rPr>
+          <w:rFonts w:ascii="Times New Roman" w:cs="Times New Roman" w:eastAsia="Times New Roman" w:hAnsi="Times New Roman"/>
+          <w:sz w:val="24"/>
+          <w:szCs w:val="24"/>
+        </w:rPr>
+        <w:t xml:space="preserve"/>
       </w:r>
     </w:p>
     <w:p>
@@ -440,12 +442,7 @@
           <w:sz w:val="24"/>
           <w:szCs w:val="24"/>
         </w:rPr>
-        <w:t xml:space="preserve">2026</w:t>
-      </w:r>
-    </w:p>
-    <w:p>
-      <w:r>
-        <w:br w:type="page"/>
+        <w:t xml:space="preserve">LIMEIRA – SP</w:t>
       </w:r>
     </w:p>
     <w:p>
@@ -456,6 +453,25 @@
       <w:r>
         <w:rPr>
           <w:rFonts w:ascii="Times New Roman" w:cs="Times New Roman" w:eastAsia="Times New Roman" w:hAnsi="Times New Roman"/>
+          <w:sz w:val="24"/>
+          <w:szCs w:val="24"/>
+        </w:rPr>
+        <w:t xml:space="preserve">2026</w:t>
+      </w:r>
+    </w:p>
+    <w:p>
+      <w:r>
+        <w:br w:type="page"/>
+      </w:r>
+    </w:p>
+    <w:p>
+      <w:pPr>
+        <w:spacing w:after="0" w:before="0" w:line="360"/>
+        <w:jc w:val="center"/>
+      </w:pPr>
+      <w:r>
+        <w:rPr>
+          <w:rFonts w:ascii="Times New Roman" w:cs="Times New Roman" w:eastAsia="Times New Roman" w:hAnsi="Times New Roman"/>
           <w:b/>
           <w:bCs/>
           <w:sz w:val="24"/>
@@ -610,7 +626,23 @@
           <w:sz w:val="24"/>
           <w:szCs w:val="24"/>
         </w:rPr>
-        <w:t xml:space="preserve">MISTURADOR AUTOMÁTICO DE LÍQUIDOS COM CLP ALTUS NEXTO XP340 E IHM</w:t>
+        <w:t xml:space="preserve">MISTURADOR AUTOMÁTICO DE LÍQUIDOS</w:t>
+      </w:r>
+    </w:p>
+    <w:p>
+      <w:pPr>
+        <w:spacing w:after="0" w:before="0" w:line="360"/>
+        <w:jc w:val="center"/>
+      </w:pPr>
+      <w:r>
+        <w:rPr>
+          <w:rFonts w:ascii="Times New Roman" w:cs="Times New Roman" w:eastAsia="Times New Roman" w:hAnsi="Times New Roman"/>
+          <w:b/>
+          <w:bCs/>
+          <w:sz w:val="24"/>
+          <w:szCs w:val="24"/>
+        </w:rPr>
+        <w:t xml:space="preserve">COM CLP ALTUS NEXTO XP340 E IHM</w:t>
       </w:r>
     </w:p>
     <w:p>
@@ -678,7 +710,7 @@
           <w:sz w:val="22"/>
           <w:szCs w:val="22"/>
         </w:rPr>
-        <w:t xml:space="preserve">Professor responsável: ______________________.</w:t>
+        <w:t xml:space="preserve">Professor responsável: Roberto Quini.</w:t>
       </w:r>
     </w:p>
     <w:p>
@@ -1510,7 +1542,7 @@
           <w:sz w:val="24"/>
           <w:szCs w:val="24"/>
         </w:rPr>
-        <w:t xml:space="preserve">Este pré-projeto propõe o desenvolvimento de um misturador automático de líquidos na bancada didática da disciplina, composta pelo CLP Altus Nexto Xpress XP340 e por uma interface homem-máquina (IHM) Altus de sete polegadas. O operador define na IHM a receita, isto é, a quantidade de cada líquido, em litros ou em porcentagem do volume total, o modo de acionamento das bombas, o tempo de mistura e o número de repetições, e o CLP executa o ciclo completo de enchimento, mistura e esvaziamento do tambor.</w:t>
+        <w:t xml:space="preserve">Este pré-projeto propõe o desenvolvimento de um misturador automático de líquidos na bancada didática da disciplina, composta pelo CLP Altus Nexto Xpress XP340 e por uma interface homem-máquina (IHM) Altus P2070NA, de sete polegadas. O operador define na IHM a receita, isto é, a quantidade de cada líquido, em litros ou em porcentagem do volume total, o modo de acionamento das bombas, o tempo de mistura e o número de repetições, e o CLP executa o ciclo completo de enchimento, mistura e esvaziamento do tambor.</w:t>
       </w:r>
     </w:p>
     <w:p>
@@ -1543,7 +1575,7 @@
           <w:sz w:val="24"/>
           <w:szCs w:val="24"/>
         </w:rPr>
-        <w:t xml:space="preserve">, calculada a partir da vazão nominal de cada bomba e do tempo em que ela permanece ligada. As saídas digitais e o motor da bancada sinalizam o estado real dos atuadores, e a tela da IHM exibe uma representação animada do processo. A delimitação do trabalho abrange a lógica de controle, a interface de operação e a simulação; a montagem de um tambor físico, a instrumentação de nível real e a dosagem de líquidos verdadeiros ficam fora do escopo.</w:t>
+        <w:t xml:space="preserve">, calculada a partir da vazão nominal de cada bomba e do tempo em que ela permanece ligada. Bombas, válvula e motor do misturador são representados por saídas digitais da bancada, que correspondem aos sinais de comando enviados a esses equipamentos em uma instalação real, e a tela da IHM exibe uma representação animada do processo. A delimitação do trabalho abrange a lógica de controle, a interface de operação e a simulação; o acionamento do motor e do inversor de frequência da bancada, a montagem de um tambor físico, a instrumentação de nível real e a dosagem de líquidos verdadeiros ficam fora do escopo.</w:t>
       </w:r>
     </w:p>
     <w:p>
@@ -1590,7 +1622,7 @@
           <w:sz w:val="24"/>
           <w:szCs w:val="24"/>
         </w:rPr>
-        <w:t xml:space="preserve">Do ponto de vista didático, o projeto reúne em uma única aplicação os principais conteúdos da disciplina: programação conforme a norma IEC 61131-3, estruturação da lógica como máquina de estados, uso de temporizadores e de variáveis reais, comunicação entre CLP e IHM por MODBUS TCP e desenvolvimento de telas de operação e de sinótico. A simulação do nível por vazão e tempo permite demonstrar o processo completo na bancada sem a necessidade de tanques, sensores de nível ou hidráulica, o que mantém o custo nulo e o foco no controle.</w:t>
+        <w:t xml:space="preserve">Do ponto de vista didático, o projeto reúne em uma única aplicação os principais conteúdos da disciplina: programação conforme a norma IEC 61131-3, estruturação da lógica como máquina de estados, uso de temporizadores e de variáveis reais, comunicação entre CLP e IHM e desenvolvimento de telas de operação e de sinótico. A simulação do nível por vazão e tempo permite demonstrar o processo completo na bancada sem a necessidade de tanques, sensores de nível ou hidráulica, o que mantém o custo nulo e o foco no controle.</w:t>
       </w:r>
     </w:p>
     <w:p>
@@ -1639,7 +1671,7 @@
           <w:sz w:val="24"/>
           <w:szCs w:val="24"/>
         </w:rPr>
-        <w:t xml:space="preserve">Desenvolver o programa de controle e a interface de operação de um misturador automático de dois líquidos, implementado como máquina de estados no CLP Altus Nexto XP340 e operado por IHM, com simulação do nível do tambor a partir da vazão das bombas.</w:t>
+        <w:t xml:space="preserve">Desenvolver o programa de controle e a interface de operação de um misturador automático de dois líquidos, implementado como máquina de estados no CLP Altus Nexto XP340 e operado pela IHM Altus P2070NA, com simulação do nível do tambor a partir da vazão das bombas.</w:t>
       </w:r>
     </w:p>
     <w:p>
@@ -1675,7 +1707,7 @@
           <w:sz w:val="24"/>
           <w:szCs w:val="24"/>
         </w:rPr>
-        <w:t xml:space="preserve">Modelar o processo em cinco estados — informações, enchendo, misturando, esvaziando e finalizado — com as respectivas condições de transição.</w:t>
+        <w:t xml:space="preserve">Modelar o processo em cinco estados — aguardando informações, enchendo, misturando, esvaziando e finalizado — com as respectivas condições de transição.</w:t>
       </w:r>
     </w:p>
     <w:p>
@@ -1694,7 +1726,7 @@
           <w:sz w:val="24"/>
           <w:szCs w:val="24"/>
         </w:rPr>
-        <w:t xml:space="preserve">Implementar o cálculo da variável </w:t>
+        <w:t xml:space="preserve">Programar em diagrama ladder o cálculo da variável </w:t>
       </w:r>
       <w:r>
         <w:rPr>
@@ -1769,7 +1801,7 @@
           <w:sz w:val="24"/>
           <w:szCs w:val="24"/>
         </w:rPr>
-        <w:t xml:space="preserve">Desenvolver as telas de parâmetros, de sinótico animado e de finalização na IHM, integradas ao CLP por MODBUS TCP.</w:t>
+        <w:t xml:space="preserve">Desenvolver as telas de parâmetros, de sinótico animado e de finalização na IHM, integradas ao CLP.</w:t>
       </w:r>
     </w:p>
     <w:p>
@@ -1837,7 +1869,7 @@
           <w:sz w:val="24"/>
           <w:szCs w:val="24"/>
         </w:rPr>
-        <w:t xml:space="preserve">O CLP é um computador industrial que executa ciclicamente a leitura das entradas, o processamento do programa do usuário e a atualização das saídas (PETRUZELLA, 2014). A norma IEC 61131-3 padroniza as linguagens de programação desses equipamentos — texto estruturado (ST), diagrama ladder (LD), diagrama de blocos de funções (FBD), sequenciamento gráfico de funções (SFC) e, na implementação do MasterTool IEC XE, o diagrama contínuo de funções (CFC) — além dos tipos de dados e dos blocos padronizados, como os temporizadores TON e os detectores de borda R_TRIG (INTERNATIONAL ELECTROTECHNICAL COMMISSION, 2013).</w:t>
+        <w:t xml:space="preserve">O CLP é um computador industrial que executa ciclicamente a leitura das entradas, o processamento do programa do usuário e a atualização das saídas (PETRUZELLA, 2014). A norma IEC 61131-3 padroniza as linguagens de programação desses equipamentos — texto estruturado (ST), diagrama ladder (LD), diagrama de blocos de funções (FBD), sequenciamento gráfico de funções (SFC) e, na implementação do MasterTool IEC XE, o diagrama contínuo de funções (CFC) — além dos tipos de dados e dos blocos padronizados, como os temporizadores TON e os detectores de borda R_TRIG (INTERNATIONAL ELECTROTECHNICAL COMMISSION, 2013). Neste projeto, o programa será desenvolvido em diagrama ladder.</w:t>
       </w:r>
     </w:p>
     <w:p>
@@ -1884,7 +1916,7 @@
           <w:sz w:val="24"/>
           <w:szCs w:val="24"/>
         </w:rPr>
-        <w:t xml:space="preserve">Processos sequenciais, como a batelada de um misturador, são descritos de forma natural por máquinas de estados finitos: o sistema permanece em um único estado por vez, cada estado define o valor das saídas e cada transição é disparada por uma condição lógica (GEORGINI, 2007). Em texto estruturado, essa organização é implementada por uma variável de estado avaliada em uma instrução CASE, o que torna o programa legível, facilita a depuração e impede o acionamento simultâneo de etapas incompatíveis, como encher e esvaziar o tambor ao mesmo tempo.</w:t>
+        <w:t xml:space="preserve">Processos sequenciais, como a batelada de um misturador, são descritos de forma natural por máquinas de estados finitos: o sistema permanece em um único estado por vez, cada estado define o valor das saídas e cada transição é disparada por uma condição lógica (GEORGINI, 2007). Em diagrama ladder, essa organização é implementada por uma variável inteira de estado: em cada degrau, um bloco de comparação EQ verifica o estado atual e habilita as saídas correspondentes, e um bloco MOVE carrega o número do estado seguinte quando a condição de transição é satisfeita. Essa estrutura torna o programa legível, facilita a depuração e impede o acionamento simultâneo de etapas incompatíveis, como encher e esvaziar o tambor ao mesmo tempo.</w:t>
       </w:r>
     </w:p>
     <w:p>
@@ -1960,7 +1992,7 @@
           <w:sz w:val="24"/>
           <w:szCs w:val="24"/>
         </w:rPr>
-        <w:t xml:space="preserve">No CLP, o tempo é discretizado pelo período da tarefa cíclica Δt. A cada varredura, o nível do tambor é atualizado pela soma das vazões de entrada das bombas ligadas menos a vazão de saída da bomba de esvaziamento, segundo a Equação 2, em que b₁, b₂ e b₃ valem 1 quando a respectiva bomba está ligada e 0 quando está desligada.</w:t>
+        <w:t xml:space="preserve">No CLP, o tempo é discretizado pelo período da tarefa cíclica Δt. A cada varredura, o nível do tambor é atualizado pela soma das vazões de entrada das bombas ligadas menos a vazão de saída da bomba de esvaziamento, segundo a Equação 2, em que b₁, b₂ e b₃ valem 1 quando a respectiva bomba está ligada e 0 quando está desligada. Em ladder, a equação é implementada por blocos aritméticos MUL, ADD e SUB habilitados pelos contatos das saídas das bombas.</w:t>
       </w:r>
     </w:p>
     <w:p>
@@ -2036,7 +2068,7 @@
           <w:sz w:val="24"/>
           <w:szCs w:val="24"/>
         </w:rPr>
-        <w:t xml:space="preserve">A IHM é o meio pelo qual o operador ajusta parâmetros, comanda o processo e acompanha seu andamento. A IHM da bancada é compatível com o modelo Altus P2070NA, de sete polegadas e 800 × 480 pixels, programado pelo software FvDesigner e integrado ao CLP por MODBUS TCP, com a IHM como mestre e o CLP como servidor (ALTUS SISTEMAS DE AUTOMAÇÃO, 2024b). Recursos como objetos de entrada numérica, barras de nível, troca de cor e de imagem por variável permitem construir um sinótico animado que reproduz o estado do processo em tempo real.</w:t>
+        <w:t xml:space="preserve">A IHM é o meio pelo qual o operador ajusta parâmetros, comanda o processo e acompanha seu andamento. A IHM da bancada é o modelo Altus P2070NA, da Série P2, de sete polegadas e 800 × 480 pixels, programado pelo software FvDesigner e integrado ao CLP por MODBUS TCP, com a IHM como mestre e o CLP como servidor (ALTUS SISTEMAS DE AUTOMAÇÃO, 2024b). Recursos como objetos de entrada numérica, barras de nível, troca de cor e de imagem por variável permitem construir um sinótico animado que reproduz o estado do processo em tempo real.</w:t>
       </w:r>
     </w:p>
     <w:p>
@@ -2412,7 +2444,7 @@
                 <w:sz w:val="20"/>
                 <w:szCs w:val="20"/>
               </w:rPr>
-              <w:t xml:space="preserve">Altus 7" Ethernet (compatível com P2070NA)</w:t>
+              <w:t xml:space="preserve">Altus P2070NA, 7", Ethernet</w:t>
             </w:r>
           </w:p>
         </w:tc>
@@ -2557,7 +2589,7 @@
                 <w:sz w:val="20"/>
                 <w:szCs w:val="20"/>
               </w:rPr>
-              <w:t xml:space="preserve">Programação em ST, depuração e simulação</w:t>
+              <w:t xml:space="preserve">Programação em diagrama ladder, depuração e simulação</w:t>
             </w:r>
           </w:p>
         </w:tc>
@@ -2852,7 +2884,7 @@
                 <w:sz w:val="20"/>
                 <w:szCs w:val="20"/>
               </w:rPr>
-              <w:t xml:space="preserve">Sinalizadores, solenoide SV1, motor WEG via CFW500</w:t>
+              <w:t xml:space="preserve">Sinalizadores e solenoide SV1 do manifold</w:t>
             </w:r>
           </w:p>
         </w:tc>
@@ -2887,7 +2919,7 @@
                 <w:sz w:val="20"/>
                 <w:szCs w:val="20"/>
               </w:rPr>
-              <w:t xml:space="preserve">Representação física das bombas, da válvula e do misturador</w:t>
+              <w:t xml:space="preserve">Saídas digitais de comando das bombas, do misturador e da válvula</w:t>
             </w:r>
           </w:p>
         </w:tc>
@@ -2935,7 +2967,7 @@
           <w:sz w:val="24"/>
           <w:szCs w:val="24"/>
         </w:rPr>
-        <w:t xml:space="preserve">O tambor recebe dois líquidos, L1 e L2, transferidos respectivamente pelas bombas B1 e B2, de vazões nominais diferentes. A mistura é feita pelo motor M1 e o esvaziamento pela abertura da válvula de saída V1 em conjunto com a bomba B3. A receita pode ser informada de duas formas, selecionadas na IHM:</w:t>
+        <w:t xml:space="preserve">O tambor recebe dois líquidos, L1 e L2, transferidos respectivamente pelas bombas B1 e B2, de vazões nominais diferentes. A mistura é feita pelo motor M1, representado por uma saída digital de comando, e o esvaziamento pela abertura da válvula de saída V1 em conjunto com a bomba B3. A receita pode ser informada de duas formas, selecionadas na IHM:</w:t>
       </w:r>
     </w:p>
     <w:p>
@@ -3066,7 +3098,7 @@
       <w:r>
         <w:drawing>
           <wp:inline distT="0" distB="0" distL="0" distR="0">
-            <wp:extent cx="3810000" cy="3933825"/>
+            <wp:extent cx="3810000" cy="4038600"/>
             <wp:effectExtent t="0" r="0" b="0" l="0"/>
             <wp:docPr id="2" name="estados" descr="Diagrama dos cinco estados do misturador" title="Máquina de estados"/>
             <wp:cNvGraphicFramePr>
@@ -3091,7 +3123,7 @@
                   <pic:spPr bwMode="auto">
                     <a:xfrm>
                       <a:off x="0" y="0"/>
-                      <a:ext cx="3810000" cy="3933825"/>
+                      <a:ext cx="3810000" cy="4038600"/>
                     </a:xfrm>
                     <a:prstGeom prst="rect">
                       <a:avLst/>
@@ -3296,7 +3328,7 @@
                 <w:sz w:val="20"/>
                 <w:szCs w:val="20"/>
               </w:rPr>
-              <w:t xml:space="preserve">E1 – Informações</w:t>
+              <w:t xml:space="preserve">E1 – Aguardando informações</w:t>
             </w:r>
           </w:p>
         </w:tc>
@@ -3855,7 +3887,7 @@
           <w:sz w:val="24"/>
           <w:szCs w:val="24"/>
         </w:rPr>
-        <w:t xml:space="preserve"> é limitada a zero para evitar valores negativos causados pela discretização. O sinal de liberação do próximo ciclo e o botão OK da IHM são tratados por detecção de borda (R_TRIG), de modo que um sinal mantido não dispare mais de um ciclo. Como requisito de segurança, um comando de parada desliga todas as saídas e retorna o processo a E1 a partir de qualquer estado.</w:t>
+        <w:t xml:space="preserve"> é limitada a zero para evitar valores negativos causados pela discretização. O sinal de liberação do próximo ciclo e o botão OK da IHM são tratados por contatos de detecção de borda de subida, de modo que um sinal mantido não dispare mais de um ciclo. Como requisito de segurança, um comando de parada desliga todas as saídas e retorna o processo a E1 a partir de qualquer estado.</w:t>
       </w:r>
     </w:p>
     <w:p>
@@ -6476,7 +6508,7 @@
                 <w:sz w:val="20"/>
                 <w:szCs w:val="20"/>
               </w:rPr>
-              <w:t xml:space="preserve">Q0.4</w:t>
+              <w:t xml:space="preserve">Q0.2</w:t>
             </w:r>
           </w:p>
         </w:tc>
@@ -6511,7 +6543,7 @@
                 <w:sz w:val="20"/>
                 <w:szCs w:val="20"/>
               </w:rPr>
-              <w:t xml:space="preserve">Sinalizador 5 – amarelo</w:t>
+              <w:t xml:space="preserve">Sinalizador 3 – vermelho</w:t>
             </w:r>
           </w:p>
         </w:tc>
@@ -6546,7 +6578,7 @@
                 <w:sz w:val="20"/>
                 <w:szCs w:val="20"/>
               </w:rPr>
-              <w:t xml:space="preserve">Bomba B2 – líquido L2</w:t>
+              <w:t xml:space="preserve">Processo finalizado ou parado</w:t>
             </w:r>
           </w:p>
         </w:tc>
@@ -6586,7 +6618,7 @@
                 <w:sz w:val="20"/>
                 <w:szCs w:val="20"/>
               </w:rPr>
-              <w:t xml:space="preserve">Q0.5</w:t>
+              <w:t xml:space="preserve">Q0.3</w:t>
             </w:r>
           </w:p>
         </w:tc>
@@ -6621,7 +6653,7 @@
                 <w:sz w:val="20"/>
                 <w:szCs w:val="20"/>
               </w:rPr>
-              <w:t xml:space="preserve">Sinalizador 6 – amarelo</w:t>
+              <w:t xml:space="preserve">Sinalizador 4 – vermelho</w:t>
             </w:r>
           </w:p>
         </w:tc>
@@ -6656,7 +6688,7 @@
                 <w:sz w:val="20"/>
                 <w:szCs w:val="20"/>
               </w:rPr>
-              <w:t xml:space="preserve">Bomba B3 – esvaziamento</w:t>
+              <w:t xml:space="preserve">Motor misturador M1</w:t>
             </w:r>
           </w:p>
         </w:tc>
@@ -6696,7 +6728,7 @@
                 <w:sz w:val="20"/>
                 <w:szCs w:val="20"/>
               </w:rPr>
-              <w:t xml:space="preserve">Q0.2</w:t>
+              <w:t xml:space="preserve">Q0.4</w:t>
             </w:r>
           </w:p>
         </w:tc>
@@ -6731,7 +6763,7 @@
                 <w:sz w:val="20"/>
                 <w:szCs w:val="20"/>
               </w:rPr>
-              <w:t xml:space="preserve">Sinalizador 3 – vermelho</w:t>
+              <w:t xml:space="preserve">Sinalizador 5 – amarelo</w:t>
             </w:r>
           </w:p>
         </w:tc>
@@ -6766,7 +6798,7 @@
                 <w:sz w:val="20"/>
                 <w:szCs w:val="20"/>
               </w:rPr>
-              <w:t xml:space="preserve">Processo finalizado ou parado</w:t>
+              <w:t xml:space="preserve">Bomba B2 – líquido L2</w:t>
             </w:r>
           </w:p>
         </w:tc>
@@ -6806,7 +6838,7 @@
                 <w:sz w:val="20"/>
                 <w:szCs w:val="20"/>
               </w:rPr>
-              <w:t xml:space="preserve">Q0.6</w:t>
+              <w:t xml:space="preserve">Q0.5</w:t>
             </w:r>
           </w:p>
         </w:tc>
@@ -6841,7 +6873,7 @@
                 <w:sz w:val="20"/>
                 <w:szCs w:val="20"/>
               </w:rPr>
-              <w:t xml:space="preserve">Solenoide SV1 do manifold</w:t>
+              <w:t xml:space="preserve">Sinalizador 6 – amarelo</w:t>
             </w:r>
           </w:p>
         </w:tc>
@@ -6876,7 +6908,7 @@
                 <w:sz w:val="20"/>
                 <w:szCs w:val="20"/>
               </w:rPr>
-              <w:t xml:space="preserve">Válvula de saída V1</w:t>
+              <w:t xml:space="preserve">Bomba B3 – esvaziamento</w:t>
             </w:r>
           </w:p>
         </w:tc>
@@ -6916,7 +6948,7 @@
                 <w:sz w:val="20"/>
                 <w:szCs w:val="20"/>
               </w:rPr>
-              <w:t xml:space="preserve">Rede Ethernet</w:t>
+              <w:t xml:space="preserve">Q0.6</w:t>
             </w:r>
           </w:p>
         </w:tc>
@@ -6951,7 +6983,7 @@
                 <w:sz w:val="20"/>
                 <w:szCs w:val="20"/>
               </w:rPr>
-              <w:t xml:space="preserve">Inversor WEG CFW500 e motor WEG 0,37 kW</w:t>
+              <w:t xml:space="preserve">Solenoide SV1 do manifold</w:t>
             </w:r>
           </w:p>
         </w:tc>
@@ -6986,7 +7018,7 @@
                 <w:sz w:val="20"/>
                 <w:szCs w:val="20"/>
               </w:rPr>
-              <w:t xml:space="preserve">Motor misturador M1</w:t>
+              <w:t xml:space="preserve">Válvula de saída V1</w:t>
             </w:r>
           </w:p>
         </w:tc>
@@ -7017,7 +7049,7 @@
           <w:sz w:val="24"/>
           <w:szCs w:val="24"/>
         </w:rPr>
-        <w:t xml:space="preserve">Caso o comando do inversor pela rede não esteja disponível no prazo do projeto, o motor M1 será representado pelo sinalizador 4 (Q0.3), sem prejuízo à lógica da máquina de estados.</w:t>
+        <w:t xml:space="preserve">Todos os atuadores são representados por saídas digitais, que correspondem aos sinais de comando enviados às bombas, ao motor e à válvula em uma instalação real. A válvula de saída é acionada pela solenoide SV1 do manifold, e o motor e o inversor de frequência da bancada não serão utilizados.</w:t>
       </w:r>
     </w:p>
     <w:p>
@@ -7200,7 +7232,7 @@
           <w:sz w:val="24"/>
           <w:szCs w:val="24"/>
         </w:rPr>
-        <w:t xml:space="preserve">Espera-se obter um misturador automático funcional na bancada, capaz de executar bateladas completas a partir de receitas definidas pelo operador, com dosagem proporcional correta nos modos simultâneo e sequencial, repetição automática de ciclos e acompanhamento visual do processo pela IHM. Como resultado didático, o projeto deverá demonstrar a aplicação integrada da programação estruturada em máquina de estados, do tratamento de variáveis analógicas simuladas e da comunicação entre CLP e IHM.</w:t>
+        <w:t xml:space="preserve">Espera-se obter um misturador automático funcional na bancada, capaz de executar bateladas completas a partir de receitas definidas pelo operador, com dosagem proporcional correta nos modos simultâneo e sequencial, repetição automática de ciclos e acompanhamento visual do processo pela IHM. Como resultado didático, o projeto deverá demonstrar a aplicação integrada da programação em diagrama ladder estruturada como máquina de estados, do tratamento de variáveis analógicas simuladas e da comunicação entre CLP e IHM.</w:t>
       </w:r>
     </w:p>
     <w:p>
@@ -8169,7 +8201,7 @@
                 <w:sz w:val="20"/>
                 <w:szCs w:val="20"/>
               </w:rPr>
-              <w:t xml:space="preserve">Programação da máquina de estados em ST</w:t>
+              <w:t xml:space="preserve">Programação da máquina de estados em ladder</w:t>
             </w:r>
           </w:p>
         </w:tc>

</xml_diff>